<commit_message>
chore(templates): update contract templates and forms (#684)
Routine refresh of contract template and external-form artifacts and catalog metadata. Contributions are welcome — open an issue or pull request and we'll fold it in.

Co-authored-by: OpenAgreements <noreply@openagreements.org>
</commit_message>
<xml_diff>
--- a/templates/openagreements-cc-by-4.0/openagreements-privacy-policy/template.docx
+++ b/templates/openagreements-cc-by-4.0/openagreements-privacy-policy/template.docx
@@ -586,10 +586,11 @@
       </w:r>
       <w:r>
         <w:rPr>
-          <w:b w:val="0"/>
-          <w:bCs w:val="0"/>
-        </w:rPr>
-        <w:t xml:space="preserve"/>
+          <w:b/>
+          <w:bCs/>
+          <w:highlight w:val="yellow"/>
+        </w:rPr>
+        <w:t xml:space="preserve">[The sensitive-data categories the business processes, called out separately, as a comma-separated phrase (e.g. "precise geolocation, health data"). Required when the business processes sensitive data; the sensitive-data DISCLOSURE sentence is gated on this field being non-empty, and the sensitive-data CONSENT clause is gated separately on the derived field show_sensitive_consent.]</w:t>
       </w:r>
       <w:r>
         <w:t xml:space="preserve">.</w:t>
@@ -1184,7 +1185,7 @@
         <w:ind w:left="720"/>
       </w:pPr>
       <w:r>
-        <w:t xml:space="preserve">We obtain your opt-in consent before collecting or processing your </w:t>
+        <w:t xml:space="preserve">We obtain your opt-in consent before collecting or processing the following categories of </w:t>
       </w:r>
       <w:r>
         <w:rPr>
@@ -1195,17 +1196,18 @@
         <w:t xml:space="preserve">“Sensitive Data”</w:t>
       </w:r>
       <w:r>
-        <w:t xml:space="preserve"> (</w:t>
-      </w:r>
-      <w:r>
-        <w:rPr>
-          <w:b w:val="0"/>
-          <w:bCs w:val="0"/>
-        </w:rPr>
-        <w:t xml:space="preserve"/>
-      </w:r>
-      <w:r>
-        <w:t xml:space="preserve">). You may withdraw that consent at any time at </w:t>
+        <w:t xml:space="preserve">: </w:t>
+      </w:r>
+      <w:r>
+        <w:rPr>
+          <w:b/>
+          <w:bCs/>
+          <w:highlight w:val="yellow"/>
+        </w:rPr>
+        <w:t xml:space="preserve">[The sensitive-data categories the business processes, called out separately, as a comma-separated phrase (e.g. "precise geolocation, health data"). Required when the business processes sensitive data; the sensitive-data DISCLOSURE sentence is gated on this field being non-empty, and the sensitive-data CONSENT clause is gated separately on the derived field show_sensitive_consent.]</w:t>
+      </w:r>
+      <w:r>
+        <w:t xml:space="preserve">. You may withdraw that consent at any time at </w:t>
       </w:r>
       <w:r>
         <w:rPr>

</xml_diff>